<commit_message>
Update all spec documents to v8.4 with latest features
- Added dual auth requirements (BR-004/005) and test cases (TC-005/006)
- Replaced Blackboard export with Share CSV in BRS and testing spec
- Added Share CSV test cases (TC-081/081b)
- Updated CSV export description to per-date column format
- Version history updated through v8.4
- Regenerated all Word files

Co-Authored-By: Claude Opus 4.6 (1M context) <noreply@anthropic.com>
</commit_message>
<xml_diff>
--- a/docs/business-requirements-spec.docx
+++ b/docs/business-requirements-spec.docx
@@ -42,7 +42,7 @@
         <w:t xml:space="preserve"> </w:t>
       </w:r>
       <w:r>
-        <w:t xml:space="preserve">v8.3</w:t>
+        <w:t xml:space="preserve">v8.4</w:t>
       </w:r>
       <w:r>
         <w:t xml:space="preserve"> </w:t>
@@ -58,7 +58,7 @@
         <w:t xml:space="preserve"> </w:t>
       </w:r>
       <w:r>
-        <w:t xml:space="preserve">2026-04-02</w:t>
+        <w:t xml:space="preserve">2026-04-03</w:t>
       </w:r>
       <w:r>
         <w:t xml:space="preserve"> </w:t>
@@ -428,6 +428,82 @@
           </w:p>
         </w:tc>
       </w:tr>
+      <w:tr>
+        <w:tc>
+          <w:tcPr/>
+          <w:p>
+            <w:pPr>
+              <w:pStyle w:val="Compact"/>
+              <w:jc w:val="left"/>
+            </w:pPr>
+            <w:r>
+              <w:t xml:space="preserve">BR-004</w:t>
+            </w:r>
+          </w:p>
+        </w:tc>
+        <w:tc>
+          <w:tcPr/>
+          <w:p>
+            <w:pPr>
+              <w:pStyle w:val="Compact"/>
+              <w:jc w:val="left"/>
+            </w:pPr>
+            <w:r>
+              <w:t xml:space="preserve">Professor can register both NFC staff card and password (dual auth)</w:t>
+            </w:r>
+          </w:p>
+        </w:tc>
+        <w:tc>
+          <w:tcPr/>
+          <w:p>
+            <w:pPr>
+              <w:pStyle w:val="Compact"/>
+              <w:jc w:val="left"/>
+            </w:pPr>
+            <w:r>
+              <w:t xml:space="preserve">Must</w:t>
+            </w:r>
+          </w:p>
+        </w:tc>
+      </w:tr>
+      <w:tr>
+        <w:tc>
+          <w:tcPr/>
+          <w:p>
+            <w:pPr>
+              <w:pStyle w:val="Compact"/>
+              <w:jc w:val="left"/>
+            </w:pPr>
+            <w:r>
+              <w:t xml:space="preserve">BR-005</w:t>
+            </w:r>
+          </w:p>
+        </w:tc>
+        <w:tc>
+          <w:tcPr/>
+          <w:p>
+            <w:pPr>
+              <w:pStyle w:val="Compact"/>
+              <w:jc w:val="left"/>
+            </w:pPr>
+            <w:r>
+              <w:t xml:space="preserve">Auth modal dynamically shows only registered authentication methods</w:t>
+            </w:r>
+          </w:p>
+        </w:tc>
+        <w:tc>
+          <w:tcPr/>
+          <w:p>
+            <w:pPr>
+              <w:pStyle w:val="Compact"/>
+              <w:jc w:val="left"/>
+            </w:pPr>
+            <w:r>
+              <w:t xml:space="preserve">Must</w:t>
+            </w:r>
+          </w:p>
+        </w:tc>
+      </w:tr>
     </w:tbl>
     <w:bookmarkEnd w:id="24"/>
     <w:bookmarkStart w:id="25" w:name="course-management"/>
@@ -1487,19 +1563,19 @@
               <w:jc w:val="left"/>
             </w:pPr>
             <w:r>
-              <w:t xml:space="preserve">Export in Blackboard LMS format</w:t>
-            </w:r>
-          </w:p>
-        </w:tc>
-        <w:tc>
-          <w:tcPr/>
-          <w:p>
-            <w:pPr>
-              <w:pStyle w:val="Compact"/>
-              <w:jc w:val="left"/>
-            </w:pPr>
-            <w:r>
-              <w:t xml:space="preserve">Should</w:t>
+              <w:t xml:space="preserve">CSV export with per-date columns (time, type, detail per cell)</w:t>
+            </w:r>
+          </w:p>
+        </w:tc>
+        <w:tc>
+          <w:tcPr/>
+          <w:p>
+            <w:pPr>
+              <w:pStyle w:val="Compact"/>
+              <w:jc w:val="left"/>
+            </w:pPr>
+            <w:r>
+              <w:t xml:space="preserve">Must</w:t>
             </w:r>
           </w:p>
         </w:tc>
@@ -1563,19 +1639,19 @@
               <w:jc w:val="left"/>
             </w:pPr>
             <w:r>
-              <w:t xml:space="preserve">Transfer data via Bluetooth file sharing</w:t>
-            </w:r>
-          </w:p>
-        </w:tc>
-        <w:tc>
-          <w:tcPr/>
-          <w:p>
-            <w:pPr>
-              <w:pStyle w:val="Compact"/>
-              <w:jc w:val="left"/>
-            </w:pPr>
-            <w:r>
-              <w:t xml:space="preserve">Should</w:t>
+              <w:t xml:space="preserve">Share CSV via native share sheet (Web Share API) to Gmail, WhatsApp, etc.</w:t>
+            </w:r>
+          </w:p>
+        </w:tc>
+        <w:tc>
+          <w:tcPr/>
+          <w:p>
+            <w:pPr>
+              <w:pStyle w:val="Compact"/>
+              <w:jc w:val="left"/>
+            </w:pPr>
+            <w:r>
+              <w:t xml:space="preserve">Must</w:t>
             </w:r>
           </w:p>
         </w:tc>

</xml_diff>